<commit_message>
Transaksi Keluar: CRUD lengkap + fitur baru
</commit_message>
<xml_diff>
--- a/storage/app/templates/template_surat.docx
+++ b/storage/app/templates/template_surat.docx
@@ -100,7 +100,7 @@
               </wp:anchor>
             </w:drawing>
           </mc:Choice>
-          <mc:Fallback xmlns:w16cei="http://schemas.microsoft.com/office/word/2026/wordml/cei">
+          <mc:Fallback>
             <w:pict>
               <v:rect w14:anchorId="5EE174C6" id="Rectangle 1" o:spid="_x0000_s1026" style="position:absolute;margin-left:428.15pt;margin-top:-18.25pt;width:98pt;height:21.75pt;z-index:251661312;visibility:visible;mso-wrap-style:square;mso-width-percent:0;mso-wrap-distance-left:9pt;mso-wrap-distance-top:0;mso-wrap-distance-right:9pt;mso-wrap-distance-bottom:0;mso-position-horizontal:absolute;mso-position-horizontal-relative:margin;mso-position-vertical:absolute;mso-position-vertical-relative:text;mso-width-percent:0;mso-width-relative:margin;v-text-anchor:middle" o:gfxdata="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" filled="f" strokecolor="#172c51" strokeweight=".5pt">
                 <v:textbox>
@@ -798,11 +798,108 @@
         <w:ind w:left="5760"/>
         <w:rPr>
           <w:rFonts w:ascii="Times New Roman" w:hAnsi="Times New Roman" w:cs="Times New Roman"/>
+          <w:noProof/>
           <w:sz w:val="24"/>
           <w:szCs w:val="24"/>
           <w:lang w:val="sv-SE"/>
         </w:rPr>
       </w:pPr>
+      <w:r>
+        <w:rPr>
+          <w:rFonts w:ascii="Times New Roman" w:hAnsi="Times New Roman" w:cs="Times New Roman"/>
+          <w:noProof/>
+          <w:sz w:val="24"/>
+          <w:szCs w:val="24"/>
+          <w:lang w:val="sv-SE"/>
+          <w14:ligatures w14:val="standardContextual"/>
+        </w:rPr>
+        <mc:AlternateContent>
+          <mc:Choice Requires="wps">
+            <w:drawing>
+              <wp:anchor distT="0" distB="0" distL="114300" distR="114300" simplePos="0" relativeHeight="251668480" behindDoc="0" locked="0" layoutInCell="1" allowOverlap="1" wp14:anchorId="4E6A2B21" wp14:editId="2FCAB51C">
+                <wp:simplePos x="0" y="0"/>
+                <wp:positionH relativeFrom="column">
+                  <wp:posOffset>3566160</wp:posOffset>
+                </wp:positionH>
+                <wp:positionV relativeFrom="paragraph">
+                  <wp:posOffset>121285</wp:posOffset>
+                </wp:positionV>
+                <wp:extent cx="1343025" cy="885825"/>
+                <wp:effectExtent l="0" t="0" r="0" b="0"/>
+                <wp:wrapNone/>
+                <wp:docPr id="376257742" name="Text Box 4"/>
+                <wp:cNvGraphicFramePr/>
+                <a:graphic xmlns:a="http://schemas.openxmlformats.org/drawingml/2006/main">
+                  <a:graphicData uri="http://schemas.microsoft.com/office/word/2010/wordprocessingShape">
+                    <wps:wsp>
+                      <wps:cNvSpPr txBox="1"/>
+                      <wps:spPr>
+                        <a:xfrm>
+                          <a:off x="0" y="0"/>
+                          <a:ext cx="1343025" cy="885825"/>
+                        </a:xfrm>
+                        <a:prstGeom prst="rect">
+                          <a:avLst/>
+                        </a:prstGeom>
+                        <a:noFill/>
+                        <a:ln w="6350">
+                          <a:noFill/>
+                        </a:ln>
+                      </wps:spPr>
+                      <wps:txbx>
+                        <w:txbxContent>
+                          <w:p>
+                            <w:pPr>
+                              <w:jc w:val="center"/>
+                            </w:pPr>
+                            <w:r>
+                              <w:rPr>
+                                <w:rFonts w:ascii="Times New Roman" w:hAnsi="Times New Roman" w:cs="Times New Roman"/>
+                              </w:rPr>
+                              <w:t>${ttd_peminta}</w:t>
+                            </w:r>
+                          </w:p>
+                        </w:txbxContent>
+                      </wps:txbx>
+                      <wps:bodyPr rot="0" spcFirstLastPara="0" vertOverflow="overflow" horzOverflow="overflow" vert="horz" wrap="square" lIns="91440" tIns="45720" rIns="91440" bIns="45720" numCol="1" spcCol="0" rtlCol="0" fromWordArt="0" anchor="ctr" anchorCtr="0" forceAA="0" compatLnSpc="1">
+                        <a:prstTxWarp prst="textNoShape">
+                          <a:avLst/>
+                        </a:prstTxWarp>
+                        <a:noAutofit/>
+                      </wps:bodyPr>
+                    </wps:wsp>
+                  </a:graphicData>
+                </a:graphic>
+              </wp:anchor>
+            </w:drawing>
+          </mc:Choice>
+          <mc:Fallback>
+            <w:pict>
+              <v:shapetype w14:anchorId="4E6A2B21" id="_x0000_t202" coordsize="21600,21600" o:spt="202" path="m,l,21600r21600,l21600,xe">
+                <v:stroke joinstyle="miter"/>
+                <v:path gradientshapeok="t" o:connecttype="rect"/>
+              </v:shapetype>
+              <v:shape id="Text Box 4" o:spid="_x0000_s1027" type="#_x0000_t202" style="position:absolute;left:0;text-align:left;margin-left:280.8pt;margin-top:9.55pt;width:105.75pt;height:69.75pt;z-index:251668480;visibility:visible;mso-wrap-style:square;mso-wrap-distance-left:9pt;mso-wrap-distance-top:0;mso-wrap-distance-right:9pt;mso-wrap-distance-bottom:0;mso-position-horizontal:absolute;mso-position-horizontal-relative:text;mso-position-vertical:absolute;mso-position-vertical-relative:text;v-text-anchor:middle" o:gfxdata="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" filled="f" stroked="f" strokeweight=".5pt">
+                <v:textbox>
+                  <w:txbxContent>
+                    <w:p>
+                      <w:pPr>
+                        <w:jc w:val="center"/>
+                      </w:pPr>
+                      <w:r>
+                        <w:rPr>
+                          <w:rFonts w:ascii="Times New Roman" w:hAnsi="Times New Roman" w:cs="Times New Roman"/>
+                        </w:rPr>
+                        <w:t>${ttd_peminta}</w:t>
+                      </w:r>
+                    </w:p>
+                  </w:txbxContent>
+                </v:textbox>
+              </v:shape>
+            </w:pict>
+          </mc:Fallback>
+        </mc:AlternateContent>
+      </w:r>
       <w:r>
         <w:rPr>
           <w:rFonts w:ascii="Times New Roman" w:hAnsi="Times New Roman" w:cs="Times New Roman"/>
@@ -820,17 +917,49 @@
         <w:ind w:left="5760"/>
         <w:rPr>
           <w:rFonts w:ascii="Times New Roman" w:hAnsi="Times New Roman" w:cs="Times New Roman"/>
+          <w:noProof/>
           <w:sz w:val="24"/>
           <w:szCs w:val="24"/>
           <w:lang w:val="sv-SE"/>
         </w:rPr>
       </w:pPr>
-      <w:r>
-        <w:rPr>
-          <w:rFonts w:ascii="Times New Roman" w:hAnsi="Times New Roman" w:cs="Times New Roman"/>
-        </w:rPr>
-        <w:t>${ttd_peminta}</w:t>
-      </w:r>
+    </w:p>
+    <w:p>
+      <w:pPr>
+        <w:spacing w:after="0" w:line="240" w:lineRule="auto"/>
+        <w:ind w:left="5760"/>
+        <w:rPr>
+          <w:rFonts w:ascii="Times New Roman" w:hAnsi="Times New Roman" w:cs="Times New Roman"/>
+          <w:noProof/>
+          <w:sz w:val="24"/>
+          <w:szCs w:val="24"/>
+          <w:lang w:val="sv-SE"/>
+        </w:rPr>
+      </w:pPr>
+    </w:p>
+    <w:p>
+      <w:pPr>
+        <w:spacing w:after="0" w:line="240" w:lineRule="auto"/>
+        <w:ind w:left="5760"/>
+        <w:rPr>
+          <w:rFonts w:ascii="Times New Roman" w:hAnsi="Times New Roman" w:cs="Times New Roman"/>
+          <w:noProof/>
+          <w:sz w:val="24"/>
+          <w:szCs w:val="24"/>
+          <w:lang w:val="sv-SE"/>
+        </w:rPr>
+      </w:pPr>
+    </w:p>
+    <w:p>
+      <w:pPr>
+        <w:spacing w:after="0" w:line="240" w:lineRule="auto"/>
+        <w:rPr>
+          <w:rFonts w:ascii="Times New Roman" w:hAnsi="Times New Roman" w:cs="Times New Roman"/>
+          <w:sz w:val="24"/>
+          <w:szCs w:val="24"/>
+          <w:lang w:val="sv-SE"/>
+        </w:rPr>
+      </w:pPr>
     </w:p>
     <w:p>
       <w:pPr>
@@ -1013,9 +1142,9 @@
               </wp:anchor>
             </w:drawing>
           </mc:Choice>
-          <mc:Fallback xmlns:w16cei="http://schemas.microsoft.com/office/word/2026/wordml/cei">
+          <mc:Fallback>
             <w:pict>
-              <v:rect w14:anchorId="1862CD6C" id="_x0000_s1027" style="position:absolute;margin-left:729.65pt;margin-top:-18.25pt;width:98pt;height:21.75pt;z-index:251664384;visibility:visible;mso-wrap-style:square;mso-width-percent:0;mso-wrap-distance-left:9pt;mso-wrap-distance-top:0;mso-wrap-distance-right:9pt;mso-wrap-distance-bottom:0;mso-position-horizontal:absolute;mso-position-horizontal-relative:margin;mso-position-vertical:absolute;mso-position-vertical-relative:text;mso-width-percent:0;mso-width-relative:margin;v-text-anchor:middle" o:gfxdata="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" filled="f" strokecolor="#172c51" strokeweight=".5pt">
+              <v:rect w14:anchorId="1862CD6C" id="_x0000_s1028" style="position:absolute;margin-left:729.65pt;margin-top:-18.25pt;width:98pt;height:21.75pt;z-index:251664384;visibility:visible;mso-wrap-style:square;mso-width-percent:0;mso-wrap-distance-left:9pt;mso-wrap-distance-top:0;mso-wrap-distance-right:9pt;mso-wrap-distance-bottom:0;mso-position-horizontal:absolute;mso-position-horizontal-relative:margin;mso-position-vertical:absolute;mso-position-vertical-relative:text;mso-width-percent:0;mso-width-relative:margin;v-text-anchor:middle" o:gfxdata="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" filled="f" strokecolor="#172c51" strokeweight=".5pt">
                 <v:textbox>
                   <w:txbxContent>
                     <w:p>
@@ -2822,6 +2951,98 @@
       <w:r>
         <w:rPr>
           <w:rFonts w:ascii="Times New Roman" w:hAnsi="Times New Roman" w:cs="Times New Roman"/>
+          <w:noProof/>
+          <w:sz w:val="24"/>
+          <w:szCs w:val="24"/>
+          <w:lang w:val="sv-SE"/>
+          <w14:ligatures w14:val="standardContextual"/>
+        </w:rPr>
+        <mc:AlternateContent>
+          <mc:Choice Requires="wps">
+            <w:drawing>
+              <wp:anchor distT="0" distB="0" distL="114300" distR="114300" simplePos="0" relativeHeight="251670528" behindDoc="0" locked="0" layoutInCell="1" allowOverlap="1" wp14:anchorId="4725D2D9" wp14:editId="235C6340">
+                <wp:simplePos x="0" y="0"/>
+                <wp:positionH relativeFrom="column">
+                  <wp:posOffset>6600825</wp:posOffset>
+                </wp:positionH>
+                <wp:positionV relativeFrom="paragraph">
+                  <wp:posOffset>127635</wp:posOffset>
+                </wp:positionV>
+                <wp:extent cx="1343025" cy="885825"/>
+                <wp:effectExtent l="0" t="0" r="0" b="0"/>
+                <wp:wrapNone/>
+                <wp:docPr id="2018126797" name="Text Box 4"/>
+                <wp:cNvGraphicFramePr/>
+                <a:graphic xmlns:a="http://schemas.openxmlformats.org/drawingml/2006/main">
+                  <a:graphicData uri="http://schemas.microsoft.com/office/word/2010/wordprocessingShape">
+                    <wps:wsp>
+                      <wps:cNvSpPr txBox="1"/>
+                      <wps:spPr>
+                        <a:xfrm>
+                          <a:off x="0" y="0"/>
+                          <a:ext cx="1343025" cy="885825"/>
+                        </a:xfrm>
+                        <a:prstGeom prst="rect">
+                          <a:avLst/>
+                        </a:prstGeom>
+                        <a:noFill/>
+                        <a:ln w="6350">
+                          <a:noFill/>
+                        </a:ln>
+                      </wps:spPr>
+                      <wps:txbx>
+                        <w:txbxContent>
+                          <w:p>
+                            <w:pPr>
+                              <w:jc w:val="center"/>
+                            </w:pPr>
+                            <w:r>
+                              <w:rPr>
+                                <w:rFonts w:ascii="Times New Roman" w:hAnsi="Times New Roman" w:cs="Times New Roman"/>
+                              </w:rPr>
+                              <w:t>${ttd_pbp}</w:t>
+                            </w:r>
+                          </w:p>
+                        </w:txbxContent>
+                      </wps:txbx>
+                      <wps:bodyPr rot="0" spcFirstLastPara="0" vertOverflow="overflow" horzOverflow="overflow" vert="horz" wrap="square" lIns="91440" tIns="45720" rIns="91440" bIns="45720" numCol="1" spcCol="0" rtlCol="0" fromWordArt="0" anchor="ctr" anchorCtr="0" forceAA="0" compatLnSpc="1">
+                        <a:prstTxWarp prst="textNoShape">
+                          <a:avLst/>
+                        </a:prstTxWarp>
+                        <a:noAutofit/>
+                      </wps:bodyPr>
+                    </wps:wsp>
+                  </a:graphicData>
+                </a:graphic>
+              </wp:anchor>
+            </w:drawing>
+          </mc:Choice>
+          <mc:Fallback>
+            <w:pict>
+              <v:shape w14:anchorId="4725D2D9" id="_x0000_s1029" type="#_x0000_t202" style="position:absolute;left:0;text-align:left;margin-left:519.75pt;margin-top:10.05pt;width:105.75pt;height:69.75pt;z-index:251670528;visibility:visible;mso-wrap-style:square;mso-wrap-distance-left:9pt;mso-wrap-distance-top:0;mso-wrap-distance-right:9pt;mso-wrap-distance-bottom:0;mso-position-horizontal:absolute;mso-position-horizontal-relative:text;mso-position-vertical:absolute;mso-position-vertical-relative:text;v-text-anchor:middle" o:gfxdata="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" filled="f" stroked="f" strokeweight=".5pt">
+                <v:textbox>
+                  <w:txbxContent>
+                    <w:p>
+                      <w:pPr>
+                        <w:jc w:val="center"/>
+                      </w:pPr>
+                      <w:r>
+                        <w:rPr>
+                          <w:rFonts w:ascii="Times New Roman" w:hAnsi="Times New Roman" w:cs="Times New Roman"/>
+                        </w:rPr>
+                        <w:t>${ttd_pbp}</w:t>
+                      </w:r>
+                    </w:p>
+                  </w:txbxContent>
+                </v:textbox>
+              </v:shape>
+            </w:pict>
+          </mc:Fallback>
+        </mc:AlternateContent>
+      </w:r>
+      <w:r>
+        <w:rPr>
+          <w:rFonts w:ascii="Times New Roman" w:hAnsi="Times New Roman" w:cs="Times New Roman"/>
           <w:sz w:val="24"/>
           <w:szCs w:val="24"/>
           <w:lang w:val="sv-SE"/>
@@ -2840,12 +3061,42 @@
           <w:lang w:val="sv-SE"/>
         </w:rPr>
       </w:pPr>
-      <w:r>
-        <w:rPr>
-          <w:rFonts w:ascii="Times New Roman" w:hAnsi="Times New Roman" w:cs="Times New Roman"/>
-        </w:rPr>
-        <w:t>${ttd_pbp}</w:t>
-      </w:r>
+    </w:p>
+    <w:p>
+      <w:pPr>
+        <w:spacing w:after="0" w:line="240" w:lineRule="auto"/>
+        <w:ind w:left="10800"/>
+        <w:rPr>
+          <w:rFonts w:ascii="Times New Roman" w:hAnsi="Times New Roman" w:cs="Times New Roman"/>
+          <w:sz w:val="24"/>
+          <w:szCs w:val="24"/>
+          <w:lang w:val="sv-SE"/>
+        </w:rPr>
+      </w:pPr>
+    </w:p>
+    <w:p>
+      <w:pPr>
+        <w:spacing w:after="0" w:line="240" w:lineRule="auto"/>
+        <w:ind w:left="10800"/>
+        <w:rPr>
+          <w:rFonts w:ascii="Times New Roman" w:hAnsi="Times New Roman" w:cs="Times New Roman"/>
+          <w:sz w:val="24"/>
+          <w:szCs w:val="24"/>
+          <w:lang w:val="sv-SE"/>
+        </w:rPr>
+      </w:pPr>
+    </w:p>
+    <w:p>
+      <w:pPr>
+        <w:spacing w:after="0" w:line="240" w:lineRule="auto"/>
+        <w:ind w:left="10800"/>
+        <w:rPr>
+          <w:rFonts w:ascii="Times New Roman" w:hAnsi="Times New Roman" w:cs="Times New Roman"/>
+          <w:sz w:val="24"/>
+          <w:szCs w:val="24"/>
+          <w:lang w:val="sv-SE"/>
+        </w:rPr>
+      </w:pPr>
     </w:p>
     <w:p>
       <w:pPr>
@@ -3019,9 +3270,9 @@
               </wp:anchor>
             </w:drawing>
           </mc:Choice>
-          <mc:Fallback xmlns:w16cei="http://schemas.microsoft.com/office/word/2026/wordml/cei">
+          <mc:Fallback>
             <w:pict>
-              <v:rect w14:anchorId="7D85998C" id="_x0000_s1028" style="position:absolute;margin-left:428.15pt;margin-top:-18.25pt;width:98pt;height:21.75pt;z-index:251667456;visibility:visible;mso-wrap-style:square;mso-width-percent:0;mso-wrap-distance-left:9pt;mso-wrap-distance-top:0;mso-wrap-distance-right:9pt;mso-wrap-distance-bottom:0;mso-position-horizontal:absolute;mso-position-horizontal-relative:margin;mso-position-vertical:absolute;mso-position-vertical-relative:text;mso-width-percent:0;mso-width-relative:margin;v-text-anchor:middle" o:gfxdata="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" filled="f" strokecolor="#172c51" strokeweight=".5pt">
+              <v:rect w14:anchorId="7D85998C" id="_x0000_s1030" style="position:absolute;margin-left:428.15pt;margin-top:-18.25pt;width:98pt;height:21.75pt;z-index:251667456;visibility:visible;mso-wrap-style:square;mso-width-percent:0;mso-wrap-distance-left:9pt;mso-wrap-distance-top:0;mso-wrap-distance-right:9pt;mso-wrap-distance-bottom:0;mso-position-horizontal:absolute;mso-position-horizontal-relative:margin;mso-position-vertical:absolute;mso-position-vertical-relative:text;mso-width-percent:0;mso-width-relative:margin;v-text-anchor:middle" o:gfxdata="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" filled="f" strokecolor="#172c51" strokeweight=".5pt">
                 <v:textbox>
                   <w:txbxContent>
                     <w:p>
@@ -4252,11 +4503,103 @@
         <w:ind w:left="5760"/>
         <w:rPr>
           <w:rFonts w:ascii="Times New Roman" w:hAnsi="Times New Roman" w:cs="Times New Roman"/>
-          <w:sz w:val="24"/>
-          <w:szCs w:val="24"/>
-          <w:lang w:val="sv-SE"/>
+          <w:noProof/>
         </w:rPr>
       </w:pPr>
+      <w:r>
+        <w:rPr>
+          <w:rFonts w:ascii="Times New Roman" w:hAnsi="Times New Roman" w:cs="Times New Roman"/>
+          <w:noProof/>
+          <w:sz w:val="24"/>
+          <w:szCs w:val="24"/>
+          <w:lang w:val="sv-SE"/>
+          <w14:ligatures w14:val="standardContextual"/>
+        </w:rPr>
+        <mc:AlternateContent>
+          <mc:Choice Requires="wps">
+            <w:drawing>
+              <wp:anchor distT="0" distB="0" distL="114300" distR="114300" simplePos="0" relativeHeight="251672576" behindDoc="0" locked="0" layoutInCell="1" allowOverlap="1" wp14:anchorId="1525F674" wp14:editId="670ED37A">
+                <wp:simplePos x="0" y="0"/>
+                <wp:positionH relativeFrom="column">
+                  <wp:posOffset>3467100</wp:posOffset>
+                </wp:positionH>
+                <wp:positionV relativeFrom="paragraph">
+                  <wp:posOffset>111125</wp:posOffset>
+                </wp:positionV>
+                <wp:extent cx="1343025" cy="885825"/>
+                <wp:effectExtent l="0" t="0" r="0" b="0"/>
+                <wp:wrapNone/>
+                <wp:docPr id="1659166851" name="Text Box 4"/>
+                <wp:cNvGraphicFramePr/>
+                <a:graphic xmlns:a="http://schemas.openxmlformats.org/drawingml/2006/main">
+                  <a:graphicData uri="http://schemas.microsoft.com/office/word/2010/wordprocessingShape">
+                    <wps:wsp>
+                      <wps:cNvSpPr txBox="1"/>
+                      <wps:spPr>
+                        <a:xfrm>
+                          <a:off x="0" y="0"/>
+                          <a:ext cx="1343025" cy="885825"/>
+                        </a:xfrm>
+                        <a:prstGeom prst="rect">
+                          <a:avLst/>
+                        </a:prstGeom>
+                        <a:noFill/>
+                        <a:ln w="6350">
+                          <a:noFill/>
+                        </a:ln>
+                      </wps:spPr>
+                      <wps:txbx>
+                        <w:txbxContent>
+                          <w:p>
+                            <w:pPr>
+                              <w:jc w:val="center"/>
+                            </w:pPr>
+                            <w:r>
+                              <w:rPr>
+                                <w:rFonts w:ascii="Times New Roman" w:hAnsi="Times New Roman" w:cs="Times New Roman"/>
+                                <w:lang w:val="sv-SE"/>
+                              </w:rPr>
+                              <w:t>${ttd_kepsek}</w:t>
+                            </w:r>
+                          </w:p>
+                        </w:txbxContent>
+                      </wps:txbx>
+                      <wps:bodyPr rot="0" spcFirstLastPara="0" vertOverflow="overflow" horzOverflow="overflow" vert="horz" wrap="square" lIns="91440" tIns="45720" rIns="91440" bIns="45720" numCol="1" spcCol="0" rtlCol="0" fromWordArt="0" anchor="ctr" anchorCtr="0" forceAA="0" compatLnSpc="1">
+                        <a:prstTxWarp prst="textNoShape">
+                          <a:avLst/>
+                        </a:prstTxWarp>
+                        <a:noAutofit/>
+                      </wps:bodyPr>
+                    </wps:wsp>
+                  </a:graphicData>
+                </a:graphic>
+              </wp:anchor>
+            </w:drawing>
+          </mc:Choice>
+          <mc:Fallback>
+            <w:pict>
+              <v:shape w14:anchorId="1525F674" id="_x0000_s1031" type="#_x0000_t202" style="position:absolute;left:0;text-align:left;margin-left:273pt;margin-top:8.75pt;width:105.75pt;height:69.75pt;z-index:251672576;visibility:visible;mso-wrap-style:square;mso-wrap-distance-left:9pt;mso-wrap-distance-top:0;mso-wrap-distance-right:9pt;mso-wrap-distance-bottom:0;mso-position-horizontal:absolute;mso-position-horizontal-relative:text;mso-position-vertical:absolute;mso-position-vertical-relative:text;v-text-anchor:middle" o:gfxdata="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" filled="f" stroked="f" strokeweight=".5pt">
+                <v:textbox>
+                  <w:txbxContent>
+                    <w:p>
+                      <w:pPr>
+                        <w:jc w:val="center"/>
+                      </w:pPr>
+                      <w:r>
+                        <w:rPr>
+                          <w:rFonts w:ascii="Times New Roman" w:hAnsi="Times New Roman" w:cs="Times New Roman"/>
+                          <w:lang w:val="sv-SE"/>
+                        </w:rPr>
+                        <w:t>${ttd_kepsek}</w:t>
+                      </w:r>
+                    </w:p>
+                  </w:txbxContent>
+                </v:textbox>
+              </v:shape>
+            </w:pict>
+          </mc:Fallback>
+        </mc:AlternateContent>
+      </w:r>
       <w:r>
         <w:rPr>
           <w:rFonts w:ascii="Times New Roman" w:hAnsi="Times New Roman" w:cs="Times New Roman"/>
@@ -4271,17 +4614,45 @@
         <w:ind w:left="5760"/>
         <w:rPr>
           <w:rFonts w:ascii="Times New Roman" w:hAnsi="Times New Roman" w:cs="Times New Roman"/>
-          <w:sz w:val="24"/>
-          <w:szCs w:val="24"/>
-          <w:lang w:val="sv-SE"/>
+          <w:noProof/>
         </w:rPr>
       </w:pPr>
-      <w:r>
-        <w:rPr>
-          <w:rFonts w:ascii="Times New Roman" w:hAnsi="Times New Roman" w:cs="Times New Roman"/>
-        </w:rPr>
-        <w:t>${ttd_kepsek}</w:t>
-      </w:r>
+    </w:p>
+    <w:p>
+      <w:pPr>
+        <w:spacing w:after="0" w:line="240" w:lineRule="auto"/>
+        <w:ind w:left="5760"/>
+        <w:rPr>
+          <w:rFonts w:ascii="Times New Roman" w:hAnsi="Times New Roman" w:cs="Times New Roman"/>
+          <w:sz w:val="24"/>
+          <w:szCs w:val="24"/>
+          <w:lang w:val="sv-SE"/>
+        </w:rPr>
+      </w:pPr>
+    </w:p>
+    <w:p>
+      <w:pPr>
+        <w:spacing w:after="0" w:line="240" w:lineRule="auto"/>
+        <w:ind w:left="5760"/>
+        <w:rPr>
+          <w:rFonts w:ascii="Times New Roman" w:hAnsi="Times New Roman" w:cs="Times New Roman"/>
+          <w:sz w:val="24"/>
+          <w:szCs w:val="24"/>
+          <w:lang w:val="sv-SE"/>
+        </w:rPr>
+      </w:pPr>
+    </w:p>
+    <w:p>
+      <w:pPr>
+        <w:spacing w:after="0" w:line="240" w:lineRule="auto"/>
+        <w:ind w:left="5760"/>
+        <w:rPr>
+          <w:rFonts w:ascii="Times New Roman" w:hAnsi="Times New Roman" w:cs="Times New Roman"/>
+          <w:sz w:val="24"/>
+          <w:szCs w:val="24"/>
+          <w:lang w:val="sv-SE"/>
+        </w:rPr>
+      </w:pPr>
     </w:p>
     <w:p>
       <w:pPr>

</xml_diff>